<commit_message>
Add Apache-2.0 LICENSE/NOTICE and copyright headers (Christopher Hinds, Stratum Labs)
- LICENSE: Apache License 2.0 full text. NOTICE: copyright plus attribution
  for the vendored third-party code, which keeps its own licenses.
- Compact copyright + SPDX-License-Identifier header on every first-party
  source, build, config and markdown file (comment syntax per file type;
  shebang preserved). Vendored third_party/ sources are untouched; only our
  own raft-lib build glue is stamped.
- docs/: license footer on every page of the Word and PDF writeups, header
  comment and visible footer on the HTML diagram, author metadata set.
- README: License section.

Verified: full rebuild is clean and all 20 ctest tests pass.

Co-Authored-By: Claude Sonnet 5.5 <noreply@anthropic.com>
</commit_message>
<xml_diff>
--- a/docs/ARCH-004-deployment-and-model-loading.docx
+++ b/docs/ARCH-004-deployment-and-model-loading.docx
@@ -9110,6 +9110,7 @@
       </w:r>
     </w:p>
     <w:sectPr>
+      <w:footerReference w:type="default" r:id="rIdFooterLicense"/>
       <w:pgSz w:w="12240" w:h="15840" w:orient="portrait"/>
       <w:pgMar w:top="1440" w:right="1440" w:bottom="1440" w:left="1440" w:header="708" w:footer="708" w:gutter="0"/>
       <w:pgNumType/>
@@ -9158,6 +9159,24 @@
     </w:p>
   </w:endnote>
 </w:endnotes>
+</file>
+
+<file path=word/footer1.xml><?xml version="1.0" encoding="utf-8"?>
+<w:ftr xmlns:w="http://schemas.openxmlformats.org/wordprocessingml/2006/main" xmlns:r="http://schemas.openxmlformats.org/officeDocument/2006/relationships">
+  <w:p>
+    <w:pPr>
+      <w:jc w:val="center"/>
+    </w:pPr>
+    <w:r>
+      <w:rPr>
+        <w:rFonts w:ascii="Calibri" w:hAnsi="Calibri"/>
+        <w:color w:val="7C8A80"/>
+        <w:sz w:val="16"/>
+      </w:rPr>
+      <w:t xml:space="preserve">Copyright 2026 Christopher Hinds, Stratum Labs. Licensed under the Apache License, Version 2.0 (SPDX: Apache-2.0).</w:t>
+    </w:r>
+  </w:p>
+</w:ftr>
 </file>
 
 <file path=word/footnotes.xml><?xml version="1.0" encoding="utf-8"?>

</xml_diff>